<commit_message>
Add logical model image; update docx; remove temp
Add Modelo Logico.png, update Respostas Avaliação Prática – Banco de Dados - Copia.docx (binary changes), and remove temporary/editor files (~$spostas Avaliação Prática – Banco de Dados - Copia.docx and ~WRL0093.tmp). Cleans up temp artifacts and adds the model diagram.
</commit_message>
<xml_diff>
--- a/Respostas Avaliação Prática – Banco de Dados - Copia.docx
+++ b/Respostas Avaliação Prática – Banco de Dados - Copia.docx
@@ -901,6 +901,46 @@
     </w:p>
     <w:p>
       <w:pPr>
+        <w:pStyle w:val="PargrafodaLista"/>
+        <w:numPr>
+          <w:ilvl w:val="0"/>
+          <w:numId w:val="7"/>
+        </w:numPr>
+        <w:jc w:val="both"/>
+        <w:rPr>
+          <w:rFonts w:ascii="Calibri Light" w:hAnsi="Calibri Light" w:cs="Calibri Light"/>
+          <w:b/>
+          <w:bCs/>
+          <w:sz w:val="28"/>
+          <w:szCs w:val="28"/>
+        </w:rPr>
+      </w:pPr>
+      <w:r>
+        <w:rPr>
+          <w:rFonts w:ascii="Calibri Light" w:hAnsi="Calibri Light" w:cs="Calibri Light"/>
+          <w:b/>
+          <w:bCs/>
+          <w:sz w:val="28"/>
+          <w:szCs w:val="28"/>
+        </w:rPr>
+        <w:t>Modelo Conceitual de Banco de Dados</w:t>
+      </w:r>
+    </w:p>
+    <w:p>
+      <w:pPr>
+        <w:ind w:left="-1" w:firstLine="0"/>
+        <w:jc w:val="both"/>
+        <w:rPr>
+          <w:rFonts w:ascii="Calibri Light" w:hAnsi="Calibri Light" w:cs="Calibri Light"/>
+          <w:b/>
+          <w:bCs/>
+          <w:sz w:val="20"/>
+          <w:szCs w:val="20"/>
+        </w:rPr>
+      </w:pPr>
+    </w:p>
+    <w:p>
+      <w:pPr>
         <w:ind w:hanging="2"/>
         <w:jc w:val="both"/>
         <w:rPr>
@@ -1954,15 +1994,297 @@
           <w:szCs w:val="20"/>
         </w:rPr>
       </w:pPr>
-      <w:r>
-        <w:rPr>
-          <w:rFonts w:ascii="Calibri Light" w:hAnsi="Calibri Light" w:cs="Calibri Light"/>
-          <w:b/>
-          <w:bCs/>
-          <w:sz w:val="20"/>
-          <w:szCs w:val="20"/>
-        </w:rPr>
-        <w:lastRenderedPageBreak/>
+    </w:p>
+    <w:p>
+      <w:pPr>
+        <w:ind w:firstLine="0"/>
+        <w:jc w:val="both"/>
+        <w:rPr>
+          <w:rFonts w:ascii="Calibri Light" w:hAnsi="Calibri Light" w:cs="Calibri Light"/>
+          <w:b/>
+          <w:bCs/>
+          <w:sz w:val="20"/>
+          <w:szCs w:val="20"/>
+        </w:rPr>
+      </w:pPr>
+    </w:p>
+    <w:p>
+      <w:pPr>
+        <w:ind w:firstLine="0"/>
+        <w:jc w:val="both"/>
+        <w:rPr>
+          <w:rFonts w:ascii="Calibri Light" w:hAnsi="Calibri Light" w:cs="Calibri Light"/>
+          <w:b/>
+          <w:bCs/>
+          <w:sz w:val="20"/>
+          <w:szCs w:val="20"/>
+        </w:rPr>
+      </w:pPr>
+    </w:p>
+    <w:p>
+      <w:pPr>
+        <w:ind w:firstLine="0"/>
+        <w:jc w:val="both"/>
+        <w:rPr>
+          <w:rFonts w:ascii="Calibri Light" w:hAnsi="Calibri Light" w:cs="Calibri Light"/>
+          <w:b/>
+          <w:bCs/>
+          <w:sz w:val="20"/>
+          <w:szCs w:val="20"/>
+        </w:rPr>
+      </w:pPr>
+    </w:p>
+    <w:p>
+      <w:pPr>
+        <w:ind w:firstLine="0"/>
+        <w:jc w:val="both"/>
+        <w:rPr>
+          <w:rFonts w:ascii="Calibri Light" w:hAnsi="Calibri Light" w:cs="Calibri Light"/>
+          <w:b/>
+          <w:bCs/>
+          <w:sz w:val="20"/>
+          <w:szCs w:val="20"/>
+        </w:rPr>
+      </w:pPr>
+    </w:p>
+    <w:p>
+      <w:pPr>
+        <w:ind w:firstLine="0"/>
+        <w:jc w:val="both"/>
+        <w:rPr>
+          <w:rFonts w:ascii="Calibri Light" w:hAnsi="Calibri Light" w:cs="Calibri Light"/>
+          <w:b/>
+          <w:bCs/>
+          <w:sz w:val="20"/>
+          <w:szCs w:val="20"/>
+        </w:rPr>
+      </w:pPr>
+    </w:p>
+    <w:p>
+      <w:pPr>
+        <w:ind w:firstLine="0"/>
+        <w:jc w:val="both"/>
+        <w:rPr>
+          <w:rFonts w:ascii="Calibri Light" w:hAnsi="Calibri Light" w:cs="Calibri Light"/>
+          <w:b/>
+          <w:bCs/>
+          <w:sz w:val="20"/>
+          <w:szCs w:val="20"/>
+        </w:rPr>
+      </w:pPr>
+    </w:p>
+    <w:p>
+      <w:pPr>
+        <w:ind w:firstLine="0"/>
+        <w:jc w:val="both"/>
+        <w:rPr>
+          <w:rFonts w:ascii="Calibri Light" w:hAnsi="Calibri Light" w:cs="Calibri Light"/>
+          <w:b/>
+          <w:bCs/>
+          <w:sz w:val="20"/>
+          <w:szCs w:val="20"/>
+        </w:rPr>
+      </w:pPr>
+    </w:p>
+    <w:p>
+      <w:pPr>
+        <w:ind w:firstLine="0"/>
+        <w:jc w:val="both"/>
+        <w:rPr>
+          <w:rFonts w:ascii="Calibri Light" w:hAnsi="Calibri Light" w:cs="Calibri Light"/>
+          <w:b/>
+          <w:bCs/>
+          <w:sz w:val="20"/>
+          <w:szCs w:val="20"/>
+        </w:rPr>
+      </w:pPr>
+    </w:p>
+    <w:p>
+      <w:pPr>
+        <w:ind w:firstLine="0"/>
+        <w:jc w:val="both"/>
+        <w:rPr>
+          <w:rFonts w:ascii="Calibri Light" w:hAnsi="Calibri Light" w:cs="Calibri Light"/>
+          <w:b/>
+          <w:bCs/>
+          <w:sz w:val="20"/>
+          <w:szCs w:val="20"/>
+        </w:rPr>
+      </w:pPr>
+    </w:p>
+    <w:p>
+      <w:pPr>
+        <w:ind w:firstLine="0"/>
+        <w:jc w:val="both"/>
+        <w:rPr>
+          <w:rFonts w:ascii="Calibri Light" w:hAnsi="Calibri Light" w:cs="Calibri Light"/>
+          <w:b/>
+          <w:bCs/>
+          <w:sz w:val="20"/>
+          <w:szCs w:val="20"/>
+        </w:rPr>
+      </w:pPr>
+    </w:p>
+    <w:p>
+      <w:pPr>
+        <w:ind w:firstLine="0"/>
+        <w:jc w:val="both"/>
+        <w:rPr>
+          <w:rFonts w:ascii="Calibri Light" w:hAnsi="Calibri Light" w:cs="Calibri Light"/>
+          <w:b/>
+          <w:bCs/>
+          <w:sz w:val="20"/>
+          <w:szCs w:val="20"/>
+        </w:rPr>
+      </w:pPr>
+    </w:p>
+    <w:p>
+      <w:pPr>
+        <w:ind w:firstLine="0"/>
+        <w:jc w:val="both"/>
+        <w:rPr>
+          <w:rFonts w:ascii="Calibri Light" w:hAnsi="Calibri Light" w:cs="Calibri Light"/>
+          <w:b/>
+          <w:bCs/>
+          <w:sz w:val="20"/>
+          <w:szCs w:val="20"/>
+        </w:rPr>
+      </w:pPr>
+    </w:p>
+    <w:p>
+      <w:pPr>
+        <w:ind w:firstLine="0"/>
+        <w:jc w:val="both"/>
+        <w:rPr>
+          <w:rFonts w:ascii="Calibri Light" w:hAnsi="Calibri Light" w:cs="Calibri Light"/>
+          <w:b/>
+          <w:bCs/>
+          <w:sz w:val="20"/>
+          <w:szCs w:val="20"/>
+        </w:rPr>
+      </w:pPr>
+    </w:p>
+    <w:p>
+      <w:pPr>
+        <w:ind w:firstLine="0"/>
+        <w:jc w:val="both"/>
+        <w:rPr>
+          <w:rFonts w:ascii="Calibri Light" w:hAnsi="Calibri Light" w:cs="Calibri Light"/>
+          <w:b/>
+          <w:bCs/>
+          <w:sz w:val="20"/>
+          <w:szCs w:val="20"/>
+        </w:rPr>
+      </w:pPr>
+    </w:p>
+    <w:p>
+      <w:pPr>
+        <w:ind w:firstLine="0"/>
+        <w:jc w:val="both"/>
+        <w:rPr>
+          <w:rFonts w:ascii="Calibri Light" w:hAnsi="Calibri Light" w:cs="Calibri Light"/>
+          <w:b/>
+          <w:bCs/>
+          <w:sz w:val="20"/>
+          <w:szCs w:val="20"/>
+        </w:rPr>
+      </w:pPr>
+    </w:p>
+    <w:p>
+      <w:pPr>
+        <w:ind w:firstLine="0"/>
+        <w:jc w:val="both"/>
+        <w:rPr>
+          <w:rFonts w:ascii="Calibri Light" w:hAnsi="Calibri Light" w:cs="Calibri Light"/>
+          <w:b/>
+          <w:bCs/>
+          <w:sz w:val="20"/>
+          <w:szCs w:val="20"/>
+        </w:rPr>
+      </w:pPr>
+    </w:p>
+    <w:p>
+      <w:pPr>
+        <w:ind w:firstLine="0"/>
+        <w:jc w:val="both"/>
+        <w:rPr>
+          <w:rFonts w:ascii="Calibri Light" w:hAnsi="Calibri Light" w:cs="Calibri Light"/>
+          <w:b/>
+          <w:bCs/>
+          <w:sz w:val="20"/>
+          <w:szCs w:val="20"/>
+        </w:rPr>
+      </w:pPr>
+    </w:p>
+    <w:p>
+      <w:pPr>
+        <w:ind w:firstLine="0"/>
+        <w:jc w:val="both"/>
+        <w:rPr>
+          <w:rFonts w:ascii="Calibri Light" w:hAnsi="Calibri Light" w:cs="Calibri Light"/>
+          <w:b/>
+          <w:bCs/>
+          <w:sz w:val="20"/>
+          <w:szCs w:val="20"/>
+        </w:rPr>
+      </w:pPr>
+    </w:p>
+    <w:p>
+      <w:pPr>
+        <w:ind w:firstLine="0"/>
+        <w:jc w:val="both"/>
+        <w:rPr>
+          <w:rFonts w:ascii="Calibri Light" w:hAnsi="Calibri Light" w:cs="Calibri Light"/>
+          <w:b/>
+          <w:bCs/>
+          <w:sz w:val="28"/>
+          <w:szCs w:val="28"/>
+        </w:rPr>
+      </w:pPr>
+      <w:r>
+        <w:rPr>
+          <w:rFonts w:ascii="Calibri Light" w:hAnsi="Calibri Light" w:cs="Calibri Light"/>
+          <w:b/>
+          <w:bCs/>
+          <w:sz w:val="28"/>
+          <w:szCs w:val="28"/>
+        </w:rPr>
+        <w:t>2. Modelo Lógico de Banco de Dados (DER)</w:t>
+      </w:r>
+    </w:p>
+    <w:p>
+      <w:pPr>
+        <w:ind w:firstLine="0"/>
+        <w:jc w:val="both"/>
+        <w:rPr>
+          <w:rFonts w:ascii="Calibri Light" w:hAnsi="Calibri Light" w:cs="Calibri Light"/>
+          <w:b/>
+          <w:bCs/>
+          <w:sz w:val="20"/>
+          <w:szCs w:val="20"/>
+        </w:rPr>
+      </w:pPr>
+    </w:p>
+    <w:p>
+      <w:pPr>
+        <w:ind w:firstLine="0"/>
+        <w:jc w:val="both"/>
+        <w:rPr>
+          <w:rFonts w:ascii="Calibri Light" w:hAnsi="Calibri Light" w:cs="Calibri Light"/>
+          <w:b/>
+          <w:bCs/>
+          <w:sz w:val="20"/>
+          <w:szCs w:val="20"/>
+        </w:rPr>
+      </w:pPr>
+      <w:r>
+        <w:rPr>
+          <w:rFonts w:ascii="Calibri Light" w:hAnsi="Calibri Light" w:cs="Calibri Light"/>
+          <w:b/>
+          <w:bCs/>
+          <w:sz w:val="20"/>
+          <w:szCs w:val="20"/>
+        </w:rPr>
         <w:drawing>
           <wp:inline distT="0" distB="0" distL="0" distR="0" wp14:anchorId="5DB881AC" wp14:editId="0A538D36">
             <wp:extent cx="5082363" cy="3863170"/>
@@ -2039,6 +2361,95 @@
 <file path=word/numbering.xml><?xml version="1.0" encoding="utf-8"?>
 <w:numbering xmlns:wpc="http://schemas.microsoft.com/office/word/2010/wordprocessingCanvas" xmlns:cx="http://schemas.microsoft.com/office/drawing/2014/chartex" xmlns:cx1="http://schemas.microsoft.com/office/drawing/2015/9/8/chartex" xmlns:cx2="http://schemas.microsoft.com/office/drawing/2015/10/21/chartex" xmlns:cx3="http://schemas.microsoft.com/office/drawing/2016/5/9/chartex" xmlns:cx4="http://schemas.microsoft.com/office/drawing/2016/5/10/chartex" xmlns:cx5="http://schemas.microsoft.com/office/drawing/2016/5/11/chartex" xmlns:cx6="http://schemas.microsoft.com/office/drawing/2016/5/12/chartex" xmlns:cx7="http://schemas.microsoft.com/office/drawing/2016/5/13/chartex" xmlns:cx8="http://schemas.microsoft.com/office/drawing/2016/5/14/chartex" xmlns:mc="http://schemas.openxmlformats.org/markup-compatibility/2006" xmlns:aink="http://schemas.microsoft.com/office/drawing/2016/ink" xmlns:am3d="http://schemas.microsoft.com/office/drawing/2017/model3d" xmlns:o="urn:schemas-microsoft-com:office:office" xmlns:oel="http://schemas.microsoft.com/office/2019/extlst" xmlns:r="http://schemas.openxmlformats.org/officeDocument/2006/relationships" xmlns:m="http://schemas.openxmlformats.org/officeDocument/2006/math" xmlns:v="urn:schemas-microsoft-com:vml" xmlns:wp14="http://schemas.microsoft.com/office/word/2010/wordprocessingDrawing" xmlns:wp="http://schemas.openxmlformats.org/drawingml/2006/wordprocessingDrawing" xmlns:w10="urn:schemas-microsoft-com:office:word" xmlns:w="http://schemas.openxmlformats.org/wordprocessingml/2006/main" xmlns:w14="http://schemas.microsoft.com/office/word/2010/wordml" xmlns:w15="http://schemas.microsoft.com/office/word/2012/wordml" xmlns:w16cex="http://schemas.microsoft.com/office/word/2018/wordml/cex" xmlns:w16cid="http://schemas.microsoft.com/office/word/2016/wordml/cid" xmlns:w16="http://schemas.microsoft.com/office/word/2018/wordml" xmlns:w16sdtdh="http://schemas.microsoft.com/office/word/2020/wordml/sdtdatahash" xmlns:w16se="http://schemas.microsoft.com/office/word/2015/wordml/symex" xmlns:wpg="http://schemas.microsoft.com/office/word/2010/wordprocessingGroup" xmlns:wpi="http://schemas.microsoft.com/office/word/2010/wordprocessingInk" xmlns:wne="http://schemas.microsoft.com/office/word/2006/wordml" xmlns:wps="http://schemas.microsoft.com/office/word/2010/wordprocessingShape" mc:Ignorable="w14 w15 w16se w16cid w16 w16cex w16sdtdh wp14">
   <w:abstractNum w:abstractNumId="0" w15:restartNumberingAfterBreak="0">
+    <w:nsid w:val="02245F16"/>
+    <w:multiLevelType w:val="hybridMultilevel"/>
+    <w:tmpl w:val="C5F29134"/>
+    <w:lvl w:ilvl="0" w:tplc="12B8716C">
+      <w:start w:val="1"/>
+      <w:numFmt w:val="decimal"/>
+      <w:lvlText w:val="%1."/>
+      <w:lvlJc w:val="left"/>
+      <w:pPr>
+        <w:ind w:left="359" w:hanging="360"/>
+      </w:pPr>
+      <w:rPr>
+        <w:rFonts w:hint="default"/>
+      </w:rPr>
+    </w:lvl>
+    <w:lvl w:ilvl="1" w:tplc="04160019" w:tentative="1">
+      <w:start w:val="1"/>
+      <w:numFmt w:val="lowerLetter"/>
+      <w:lvlText w:val="%2."/>
+      <w:lvlJc w:val="left"/>
+      <w:pPr>
+        <w:ind w:left="1079" w:hanging="360"/>
+      </w:pPr>
+    </w:lvl>
+    <w:lvl w:ilvl="2" w:tplc="0416001B" w:tentative="1">
+      <w:start w:val="1"/>
+      <w:numFmt w:val="lowerRoman"/>
+      <w:lvlText w:val="%3."/>
+      <w:lvlJc w:val="right"/>
+      <w:pPr>
+        <w:ind w:left="1799" w:hanging="180"/>
+      </w:pPr>
+    </w:lvl>
+    <w:lvl w:ilvl="3" w:tplc="0416000F" w:tentative="1">
+      <w:start w:val="1"/>
+      <w:numFmt w:val="decimal"/>
+      <w:lvlText w:val="%4."/>
+      <w:lvlJc w:val="left"/>
+      <w:pPr>
+        <w:ind w:left="2519" w:hanging="360"/>
+      </w:pPr>
+    </w:lvl>
+    <w:lvl w:ilvl="4" w:tplc="04160019" w:tentative="1">
+      <w:start w:val="1"/>
+      <w:numFmt w:val="lowerLetter"/>
+      <w:lvlText w:val="%5."/>
+      <w:lvlJc w:val="left"/>
+      <w:pPr>
+        <w:ind w:left="3239" w:hanging="360"/>
+      </w:pPr>
+    </w:lvl>
+    <w:lvl w:ilvl="5" w:tplc="0416001B" w:tentative="1">
+      <w:start w:val="1"/>
+      <w:numFmt w:val="lowerRoman"/>
+      <w:lvlText w:val="%6."/>
+      <w:lvlJc w:val="right"/>
+      <w:pPr>
+        <w:ind w:left="3959" w:hanging="180"/>
+      </w:pPr>
+    </w:lvl>
+    <w:lvl w:ilvl="6" w:tplc="0416000F" w:tentative="1">
+      <w:start w:val="1"/>
+      <w:numFmt w:val="decimal"/>
+      <w:lvlText w:val="%7."/>
+      <w:lvlJc w:val="left"/>
+      <w:pPr>
+        <w:ind w:left="4679" w:hanging="360"/>
+      </w:pPr>
+    </w:lvl>
+    <w:lvl w:ilvl="7" w:tplc="04160019" w:tentative="1">
+      <w:start w:val="1"/>
+      <w:numFmt w:val="lowerLetter"/>
+      <w:lvlText w:val="%8."/>
+      <w:lvlJc w:val="left"/>
+      <w:pPr>
+        <w:ind w:left="5399" w:hanging="360"/>
+      </w:pPr>
+    </w:lvl>
+    <w:lvl w:ilvl="8" w:tplc="0416001B" w:tentative="1">
+      <w:start w:val="1"/>
+      <w:numFmt w:val="lowerRoman"/>
+      <w:lvlText w:val="%9."/>
+      <w:lvlJc w:val="right"/>
+      <w:pPr>
+        <w:ind w:left="6119" w:hanging="180"/>
+      </w:pPr>
+    </w:lvl>
+  </w:abstractNum>
+  <w:abstractNum w:abstractNumId="1" w15:restartNumberingAfterBreak="0">
     <w:nsid w:val="1C5E6F9D"/>
     <w:multiLevelType w:val="multilevel"/>
     <w:tmpl w:val="328A2C62"/>
@@ -2151,7 +2562,7 @@
       </w:rPr>
     </w:lvl>
   </w:abstractNum>
-  <w:abstractNum w:abstractNumId="1" w15:restartNumberingAfterBreak="0">
+  <w:abstractNum w:abstractNumId="2" w15:restartNumberingAfterBreak="0">
     <w:nsid w:val="2F685222"/>
     <w:multiLevelType w:val="multilevel"/>
     <w:tmpl w:val="754676CE"/>
@@ -2300,7 +2711,7 @@
       </w:rPr>
     </w:lvl>
   </w:abstractNum>
-  <w:abstractNum w:abstractNumId="2" w15:restartNumberingAfterBreak="0">
+  <w:abstractNum w:abstractNumId="3" w15:restartNumberingAfterBreak="0">
     <w:nsid w:val="369827BC"/>
     <w:multiLevelType w:val="multilevel"/>
     <w:tmpl w:val="2DE8955E"/>
@@ -2413,7 +2824,96 @@
       </w:rPr>
     </w:lvl>
   </w:abstractNum>
-  <w:abstractNum w:abstractNumId="3" w15:restartNumberingAfterBreak="0">
+  <w:abstractNum w:abstractNumId="4" w15:restartNumberingAfterBreak="0">
+    <w:nsid w:val="3FA429FE"/>
+    <w:multiLevelType w:val="hybridMultilevel"/>
+    <w:tmpl w:val="DF8477A2"/>
+    <w:lvl w:ilvl="0" w:tplc="BE429000">
+      <w:start w:val="1"/>
+      <w:numFmt w:val="decimal"/>
+      <w:lvlText w:val="%1."/>
+      <w:lvlJc w:val="left"/>
+      <w:pPr>
+        <w:ind w:left="358" w:hanging="360"/>
+      </w:pPr>
+      <w:rPr>
+        <w:rFonts w:hint="default"/>
+      </w:rPr>
+    </w:lvl>
+    <w:lvl w:ilvl="1" w:tplc="04160019" w:tentative="1">
+      <w:start w:val="1"/>
+      <w:numFmt w:val="lowerLetter"/>
+      <w:lvlText w:val="%2."/>
+      <w:lvlJc w:val="left"/>
+      <w:pPr>
+        <w:ind w:left="1078" w:hanging="360"/>
+      </w:pPr>
+    </w:lvl>
+    <w:lvl w:ilvl="2" w:tplc="0416001B" w:tentative="1">
+      <w:start w:val="1"/>
+      <w:numFmt w:val="lowerRoman"/>
+      <w:lvlText w:val="%3."/>
+      <w:lvlJc w:val="right"/>
+      <w:pPr>
+        <w:ind w:left="1798" w:hanging="180"/>
+      </w:pPr>
+    </w:lvl>
+    <w:lvl w:ilvl="3" w:tplc="0416000F" w:tentative="1">
+      <w:start w:val="1"/>
+      <w:numFmt w:val="decimal"/>
+      <w:lvlText w:val="%4."/>
+      <w:lvlJc w:val="left"/>
+      <w:pPr>
+        <w:ind w:left="2518" w:hanging="360"/>
+      </w:pPr>
+    </w:lvl>
+    <w:lvl w:ilvl="4" w:tplc="04160019" w:tentative="1">
+      <w:start w:val="1"/>
+      <w:numFmt w:val="lowerLetter"/>
+      <w:lvlText w:val="%5."/>
+      <w:lvlJc w:val="left"/>
+      <w:pPr>
+        <w:ind w:left="3238" w:hanging="360"/>
+      </w:pPr>
+    </w:lvl>
+    <w:lvl w:ilvl="5" w:tplc="0416001B" w:tentative="1">
+      <w:start w:val="1"/>
+      <w:numFmt w:val="lowerRoman"/>
+      <w:lvlText w:val="%6."/>
+      <w:lvlJc w:val="right"/>
+      <w:pPr>
+        <w:ind w:left="3958" w:hanging="180"/>
+      </w:pPr>
+    </w:lvl>
+    <w:lvl w:ilvl="6" w:tplc="0416000F" w:tentative="1">
+      <w:start w:val="1"/>
+      <w:numFmt w:val="decimal"/>
+      <w:lvlText w:val="%7."/>
+      <w:lvlJc w:val="left"/>
+      <w:pPr>
+        <w:ind w:left="4678" w:hanging="360"/>
+      </w:pPr>
+    </w:lvl>
+    <w:lvl w:ilvl="7" w:tplc="04160019" w:tentative="1">
+      <w:start w:val="1"/>
+      <w:numFmt w:val="lowerLetter"/>
+      <w:lvlText w:val="%8."/>
+      <w:lvlJc w:val="left"/>
+      <w:pPr>
+        <w:ind w:left="5398" w:hanging="360"/>
+      </w:pPr>
+    </w:lvl>
+    <w:lvl w:ilvl="8" w:tplc="0416001B" w:tentative="1">
+      <w:start w:val="1"/>
+      <w:numFmt w:val="lowerRoman"/>
+      <w:lvlText w:val="%9."/>
+      <w:lvlJc w:val="right"/>
+      <w:pPr>
+        <w:ind w:left="6118" w:hanging="180"/>
+      </w:pPr>
+    </w:lvl>
+  </w:abstractNum>
+  <w:abstractNum w:abstractNumId="5" w15:restartNumberingAfterBreak="0">
     <w:nsid w:val="5A2C00E9"/>
     <w:multiLevelType w:val="multilevel"/>
     <w:tmpl w:val="1CA07AB8"/>
@@ -2526,7 +3026,7 @@
       </w:rPr>
     </w:lvl>
   </w:abstractNum>
-  <w:abstractNum w:abstractNumId="4" w15:restartNumberingAfterBreak="0">
+  <w:abstractNum w:abstractNumId="6" w15:restartNumberingAfterBreak="0">
     <w:nsid w:val="77BC43FB"/>
     <w:multiLevelType w:val="multilevel"/>
     <w:tmpl w:val="8064E15A"/>
@@ -2676,19 +3176,25 @@
     </w:lvl>
   </w:abstractNum>
   <w:num w:numId="1" w16cid:durableId="1155143386">
-    <w:abstractNumId w:val="0"/>
+    <w:abstractNumId w:val="1"/>
   </w:num>
   <w:num w:numId="2" w16cid:durableId="773549423">
+    <w:abstractNumId w:val="5"/>
+  </w:num>
+  <w:num w:numId="3" w16cid:durableId="550074517">
     <w:abstractNumId w:val="3"/>
   </w:num>
-  <w:num w:numId="3" w16cid:durableId="550074517">
+  <w:num w:numId="4" w16cid:durableId="1859343286">
+    <w:abstractNumId w:val="6"/>
+  </w:num>
+  <w:num w:numId="5" w16cid:durableId="803816852">
     <w:abstractNumId w:val="2"/>
   </w:num>
-  <w:num w:numId="4" w16cid:durableId="1859343286">
+  <w:num w:numId="6" w16cid:durableId="1061945359">
     <w:abstractNumId w:val="4"/>
   </w:num>
-  <w:num w:numId="5" w16cid:durableId="803816852">
-    <w:abstractNumId w:val="1"/>
+  <w:num w:numId="7" w16cid:durableId="1320575209">
+    <w:abstractNumId w:val="0"/>
   </w:num>
 </w:numbering>
 </file>

</xml_diff>

<commit_message>
Rename SQL file and update answer docx
Rename 01_script_banco_academia.sql.sql to 01_script_banco_academia.sql to remove the duplicated .sql extension. Also update the binary docx file (Respostas Avaliação Prática – Banco de Dados - Copia.docx) — contents changed (answers/notes updated).
</commit_message>
<xml_diff>
--- a/Respostas Avaliação Prática – Banco de Dados - Copia.docx
+++ b/Respostas Avaliação Prática – Banco de Dados - Copia.docx
@@ -952,8 +952,6 @@
     <w:p>
       <w:pPr>
         <w:pStyle w:val="PargrafodaLista"/>
-        <w:ind w:left="358" w:firstLine="0"/>
-        <w:jc w:val="both"/>
         <w:rPr>
           <w:b/>
           <w:bCs/>
@@ -1234,7 +1232,7 @@
           <w:sz w:val="20"/>
           <w:szCs w:val="20"/>
         </w:rPr>
-        <w:t>Servidor (</w:t>
+        <w:t xml:space="preserve">Servidor (SGBD): O </w:t>
       </w:r>
       <w:proofErr w:type="spellStart"/>
       <w:r>
@@ -1244,7 +1242,7 @@
           <w:sz w:val="20"/>
           <w:szCs w:val="20"/>
         </w:rPr>
-        <w:t>Backend</w:t>
+        <w:t>MariaDB</w:t>
       </w:r>
       <w:proofErr w:type="spellEnd"/>
       <w:r>
@@ -1254,7 +1252,7 @@
           <w:sz w:val="20"/>
           <w:szCs w:val="20"/>
         </w:rPr>
-        <w:t xml:space="preserve">/SGBD): O serviço </w:t>
+        <w:t xml:space="preserve"> executado localmente na porta 3306 via XAMPP </w:t>
       </w:r>
       <w:proofErr w:type="spellStart"/>
       <w:r>
@@ -1264,7 +1262,7 @@
           <w:sz w:val="20"/>
           <w:szCs w:val="20"/>
         </w:rPr>
-        <w:t>MariaDB</w:t>
+        <w:t>Control</w:t>
       </w:r>
       <w:proofErr w:type="spellEnd"/>
       <w:r>
@@ -1274,7 +1272,7 @@
           <w:sz w:val="20"/>
           <w:szCs w:val="20"/>
         </w:rPr>
-        <w:t xml:space="preserve">/MySQL rodando localmente na porta 3306 via XAMPP </w:t>
+        <w:t xml:space="preserve"> </w:t>
       </w:r>
       <w:proofErr w:type="spellStart"/>
       <w:r>
@@ -1284,7 +1282,7 @@
           <w:sz w:val="20"/>
           <w:szCs w:val="20"/>
         </w:rPr>
-        <w:t>Control</w:t>
+        <w:t>Panel</w:t>
       </w:r>
       <w:proofErr w:type="spellEnd"/>
       <w:r>
@@ -1294,27 +1292,7 @@
           <w:sz w:val="20"/>
           <w:szCs w:val="20"/>
         </w:rPr>
-        <w:t xml:space="preserve"> </w:t>
-      </w:r>
-      <w:proofErr w:type="spellStart"/>
-      <w:r>
-        <w:rPr>
-          <w:b/>
-          <w:bCs/>
-          <w:sz w:val="20"/>
-          <w:szCs w:val="20"/>
-        </w:rPr>
-        <w:t>Panel</w:t>
-      </w:r>
-      <w:proofErr w:type="spellEnd"/>
-      <w:r>
-        <w:rPr>
-          <w:b/>
-          <w:bCs/>
-          <w:sz w:val="20"/>
-          <w:szCs w:val="20"/>
-        </w:rPr>
-        <w:t>, responsável por processar requisições SQL, manter a integridade transacional (ACID) e gerenciar o armazenamento em disco.</w:t>
+        <w:t xml:space="preserve"> é responsável por armazenar, gerenciar e processar as requisições SQL, manter a integridade transacional (ACID) e gerenciar o armazenamento em disco.</w:t>
       </w:r>
     </w:p>
     <w:p>
@@ -1441,7 +1419,7 @@
           <w:sz w:val="20"/>
           <w:szCs w:val="20"/>
         </w:rPr>
-        <w:t xml:space="preserve">Foi selecionado o MySQL / </w:t>
+        <w:t xml:space="preserve">Foi selecionado o SGBD </w:t>
       </w:r>
       <w:proofErr w:type="spellStart"/>
       <w:r>
@@ -1461,7 +1439,7 @@
           <w:sz w:val="20"/>
           <w:szCs w:val="20"/>
         </w:rPr>
-        <w:t xml:space="preserve"> via XAMPP pelos seguintes motivos técnicos:</w:t>
+        <w:t xml:space="preserve"> (integrado ao XAMPP) pelos seguintes motivos técnicos:</w:t>
       </w:r>
     </w:p>
     <w:p>
@@ -1888,8 +1866,50 @@
           <w:sz w:val="20"/>
           <w:szCs w:val="20"/>
         </w:rPr>
-        <w:t>).</w:t>
-      </w:r>
+        <w:t xml:space="preserve">). Exemplo prático: </w:t>
+      </w:r>
+      <w:r>
+        <w:rPr>
+          <w:b/>
+          <w:bCs/>
+          <w:sz w:val="20"/>
+          <w:szCs w:val="20"/>
+        </w:rPr>
+        <w:lastRenderedPageBreak/>
+        <w:t xml:space="preserve">Antes da normalização, o nome e o valor do plano ficariam repetidos no cadastro de cada aluno. Com a 3FN, esses dados foram centralizados na tabela planos, sendo referenciados no aluno apenas pela chave estrangeira </w:t>
+      </w:r>
+      <w:proofErr w:type="spellStart"/>
+      <w:r>
+        <w:rPr>
+          <w:b/>
+          <w:bCs/>
+          <w:sz w:val="20"/>
+          <w:szCs w:val="20"/>
+        </w:rPr>
+        <w:t>planos_id_plano</w:t>
+      </w:r>
+      <w:proofErr w:type="spellEnd"/>
+      <w:r>
+        <w:rPr>
+          <w:b/>
+          <w:bCs/>
+          <w:sz w:val="20"/>
+          <w:szCs w:val="20"/>
+        </w:rPr>
+        <w:t>.</w:t>
+      </w:r>
+    </w:p>
+    <w:p>
+      <w:pPr>
+        <w:ind w:left="720" w:firstLine="0"/>
+        <w:jc w:val="both"/>
+        <w:rPr>
+          <w:b/>
+          <w:bCs/>
+          <w:sz w:val="20"/>
+          <w:szCs w:val="20"/>
+        </w:rPr>
+      </w:pPr>
     </w:p>
     <w:p>
       <w:pPr>
@@ -1913,7 +1933,6 @@
           <w:sz w:val="20"/>
           <w:szCs w:val="20"/>
         </w:rPr>
-        <w:lastRenderedPageBreak/>
         <w:t>MODELAGEM DE DADOS (DER)</w:t>
       </w:r>
     </w:p>
@@ -2298,7 +2317,7 @@
           <w:sz w:val="20"/>
           <w:szCs w:val="20"/>
         </w:rPr>
-        <w:t>A estrutura física do banco de dados é composta por 5 tabelas relacionais (planos, instrutores, alunos, turmas e matriculas), projetadas para garantir total integridade referencial.</w:t>
+        <w:t>A estrutura física do banco de dados é composta por 5 tabelas relacionais (planos, instrutores, alunos, turmas e matriculas), projetadas para garantir a integridade referencial por meio de chaves estrangeiras.</w:t>
       </w:r>
     </w:p>
     <w:tbl>
@@ -3697,8 +3716,8 @@
           <w:szCs w:val="20"/>
         </w:rPr>
         <w:drawing>
-          <wp:inline distT="0" distB="0" distL="0" distR="0" wp14:anchorId="14C6F44E" wp14:editId="68A2C839">
-            <wp:extent cx="2695074" cy="978010"/>
+          <wp:inline distT="0" distB="0" distL="0" distR="0" wp14:anchorId="14C6F44E" wp14:editId="62FF2B1D">
+            <wp:extent cx="2710100" cy="977900"/>
             <wp:effectExtent l="0" t="0" r="0" b="0"/>
             <wp:docPr id="5" name="Imagem 5"/>
             <wp:cNvGraphicFramePr>
@@ -3720,7 +3739,7 @@
                   <pic:spPr>
                     <a:xfrm>
                       <a:off x="0" y="0"/>
-                      <a:ext cx="2733261" cy="991868"/>
+                      <a:ext cx="2753478" cy="993552"/>
                     </a:xfrm>
                     <a:prstGeom prst="rect">
                       <a:avLst/>
@@ -3734,13 +3753,16 @@
       </w:r>
       <w:r>
         <w:rPr>
-          <w:noProof/>
+          <w:b/>
+          <w:bCs/>
+          <w:sz w:val="20"/>
+          <w:szCs w:val="20"/>
         </w:rPr>
         <w:drawing>
-          <wp:inline distT="0" distB="0" distL="0" distR="0" wp14:anchorId="71785840" wp14:editId="033A6B52">
-            <wp:extent cx="2704717" cy="1009816"/>
-            <wp:effectExtent l="0" t="0" r="635" b="0"/>
-            <wp:docPr id="6" name="Imagem 6"/>
+          <wp:inline distT="0" distB="0" distL="0" distR="0" wp14:anchorId="08B3AAFE" wp14:editId="0ED1E571">
+            <wp:extent cx="2680523" cy="987384"/>
+            <wp:effectExtent l="0" t="0" r="5715" b="3810"/>
+            <wp:docPr id="10" name="Imagem 10"/>
             <wp:cNvGraphicFramePr>
               <a:graphicFrameLocks xmlns:a="http://schemas.openxmlformats.org/drawingml/2006/main" noChangeAspect="1"/>
             </wp:cNvGraphicFramePr>
@@ -3760,7 +3782,7 @@
                   <pic:spPr>
                     <a:xfrm>
                       <a:off x="0" y="0"/>
-                      <a:ext cx="2704717" cy="1009816"/>
+                      <a:ext cx="2734550" cy="1007285"/>
                     </a:xfrm>
                     <a:prstGeom prst="rect">
                       <a:avLst/>
@@ -3831,9 +3853,9 @@
           <w:szCs w:val="20"/>
         </w:rPr>
         <w:drawing>
-          <wp:inline distT="0" distB="0" distL="0" distR="0" wp14:anchorId="1DF5F702" wp14:editId="59EA72BE">
-            <wp:extent cx="2669983" cy="978010"/>
-            <wp:effectExtent l="0" t="0" r="0" b="0"/>
+          <wp:inline distT="0" distB="0" distL="0" distR="0" wp14:anchorId="1DF5F702" wp14:editId="04A39E23">
+            <wp:extent cx="2676525" cy="1046608"/>
+            <wp:effectExtent l="0" t="0" r="0" b="1270"/>
             <wp:docPr id="8" name="Imagem 8"/>
             <wp:cNvGraphicFramePr>
               <a:graphicFrameLocks xmlns:a="http://schemas.openxmlformats.org/drawingml/2006/main" noChangeAspect="1"/>
@@ -3854,7 +3876,7 @@
                   <pic:spPr>
                     <a:xfrm>
                       <a:off x="0" y="0"/>
-                      <a:ext cx="2691168" cy="985770"/>
+                      <a:ext cx="2716135" cy="1062097"/>
                     </a:xfrm>
                     <a:prstGeom prst="rect">
                       <a:avLst/>
@@ -4127,7 +4149,27 @@
           <w:sz w:val="20"/>
           <w:szCs w:val="20"/>
         </w:rPr>
-        <w:t>Política de Backup: Backup Lógico Completo semanal aos domingos, e exportação diária incremental dos dados ao final do expediente.</w:t>
+        <w:t xml:space="preserve">Política de Backup: Backup lógico completo realizado semanalmente através do utilitário </w:t>
+      </w:r>
+      <w:proofErr w:type="spellStart"/>
+      <w:r>
+        <w:rPr>
+          <w:b/>
+          <w:bCs/>
+          <w:sz w:val="20"/>
+          <w:szCs w:val="20"/>
+        </w:rPr>
+        <w:t>mysqldump</w:t>
+      </w:r>
+      <w:proofErr w:type="spellEnd"/>
+      <w:r>
+        <w:rPr>
+          <w:b/>
+          <w:bCs/>
+          <w:sz w:val="20"/>
+          <w:szCs w:val="20"/>
+        </w:rPr>
+        <w:t>. Cópias adicionais de segurança podem ser executadas conforme a necessidade de recuperação do ambiente.</w:t>
       </w:r>
     </w:p>
     <w:p>
@@ -4357,7 +4399,7 @@
           <w:sz w:val="20"/>
           <w:szCs w:val="20"/>
         </w:rPr>
-        <w:t>O sistema de banco de dados para a Academia foi modelado com 5 tabelas fundamentais, atendendo integralmente à 3ª Forma Normal. O projeto garante integridade referencial por meio de chaves estrangeiras apropriadas, consultas otimizadas com comandos JOIN e mecanismos adequados de segurança e controle de acesso para ambiente de produção.</w:t>
+        <w:t>O sistema de banco de dados para a Academia foi modelado com 5 tabelas fundamentais, atendendo integralmente à 3ª Forma Normal. O projeto garante integridade referencial por meio de chaves estrangeiras apropriadas, consultas SQL com comandos JOIN para relacionar eficientemente os dados entre as tabelas e mecanismos adequados de segurança e controle de acesso para ambiente de produção.</w:t>
       </w:r>
     </w:p>
     <w:p>
@@ -4383,6 +4425,15 @@
           <w:szCs w:val="20"/>
         </w:rPr>
       </w:pPr>
+      <w:r>
+        <w:rPr>
+          <w:b/>
+          <w:bCs/>
+          <w:sz w:val="20"/>
+          <w:szCs w:val="20"/>
+        </w:rPr>
+        <w:t>Arquivos de código:</w:t>
+      </w:r>
     </w:p>
     <w:p>
       <w:pPr>
@@ -4395,15 +4446,6 @@
           <w:szCs w:val="20"/>
         </w:rPr>
       </w:pPr>
-      <w:r>
-        <w:rPr>
-          <w:b/>
-          <w:bCs/>
-          <w:sz w:val="20"/>
-          <w:szCs w:val="20"/>
-        </w:rPr>
-        <w:t>Arquivos de código:</w:t>
-      </w:r>
     </w:p>
     <w:p>
       <w:pPr>
@@ -4428,26 +4470,8 @@
           <w:szCs w:val="20"/>
         </w:rPr>
       </w:pPr>
-    </w:p>
-    <w:p>
-      <w:pPr>
-        <w:ind w:hanging="2"/>
-        <w:jc w:val="both"/>
-        <w:rPr>
-          <w:b/>
-          <w:bCs/>
-          <w:sz w:val="20"/>
-          <w:szCs w:val="20"/>
-        </w:rPr>
-      </w:pPr>
-    </w:p>
-    <w:p>
-      <w:pPr>
-        <w:ind w:hanging="2"/>
-        <w:jc w:val="both"/>
-      </w:pPr>
-      <w:r>
-        <w:object w:dxaOrig="1536" w:dyaOrig="995" w14:anchorId="6CA5DD9A">
+      <w:r>
+        <w:object w:dxaOrig="1536" w:dyaOrig="995" w14:anchorId="701EC083">
           <v:shapetype id="_x0000_t75" coordsize="21600,21600" o:spt="75" o:preferrelative="t" path="m@4@5l@4@11@9@11@9@5xe" filled="f" stroked="f">
             <v:stroke joinstyle="miter"/>
             <v:formulas>
@@ -4467,10 +4491,10 @@
             <v:path o:extrusionok="f" gradientshapeok="t" o:connecttype="rect"/>
             <o:lock v:ext="edit" aspectratio="t"/>
           </v:shapetype>
-          <v:shape id="_x0000_i1032" type="#_x0000_t75" style="width:76.6pt;height:49.55pt" o:ole="">
+          <v:shape id="_x0000_i1035" type="#_x0000_t75" style="width:79.2pt;height:50.4pt" o:ole="">
             <v:imagedata r:id="rId13" o:title=""/>
           </v:shape>
-          <o:OLEObject Type="Embed" ProgID="Package" ShapeID="_x0000_i1032" DrawAspect="Icon" ObjectID="_1849778299" r:id="rId14"/>
+          <o:OLEObject Type="Embed" ProgID="Package" ShapeID="_x0000_i1035" DrawAspect="Icon" ObjectID="_1849781854" r:id="rId14"/>
         </w:object>
       </w:r>
     </w:p>
@@ -4484,6 +4508,12 @@
       <w:pPr>
         <w:ind w:hanging="2"/>
         <w:jc w:val="both"/>
+      </w:pPr>
+    </w:p>
+    <w:p>
+      <w:pPr>
+        <w:ind w:hanging="2"/>
+        <w:jc w:val="both"/>
         <w:rPr>
           <w:b/>
           <w:bCs/>
@@ -4496,10 +4526,10 @@
           <w:color w:val="FFFFFF" w:themeColor="background1"/>
         </w:rPr>
         <w:object w:dxaOrig="1536" w:dyaOrig="995" w14:anchorId="32335CC6">
-          <v:shape id="_x0000_i1031" type="#_x0000_t75" style="width:76.6pt;height:49.55pt" o:ole="">
+          <v:shape id="_x0000_i1031" type="#_x0000_t75" style="width:79.2pt;height:50.4pt" o:ole="">
             <v:imagedata r:id="rId15" o:title=""/>
           </v:shape>
-          <o:OLEObject Type="Embed" ProgID="Package" ShapeID="_x0000_i1031" DrawAspect="Icon" ObjectID="_1849778300" r:id="rId16"/>
+          <o:OLEObject Type="Embed" ProgID="Package" ShapeID="_x0000_i1031" DrawAspect="Icon" ObjectID="_1849781855" r:id="rId16"/>
         </w:object>
       </w:r>
     </w:p>

</xml_diff>

<commit_message>
Add evaluation archives and drive link
Add evaluation materials: avaliacao.zip and sql.7z, plus a 'link google drive.txt' containing the Drive URL. Update the Respostas Avaliação Prática - Banco de Dados - Copia.docx binary. Remove temporary/lock files (~$... docx and ~WRL2087.tmp) to clean up editor artifacts.
</commit_message>
<xml_diff>
--- a/Respostas Avaliação Prática – Banco de Dados - Copia.docx
+++ b/Respostas Avaliação Prática – Banco de Dados - Copia.docx
@@ -3381,6 +3381,7 @@
         <w:rPr>
           <w:b/>
           <w:bCs/>
+          <w:noProof/>
           <w:sz w:val="20"/>
           <w:szCs w:val="20"/>
         </w:rPr>
@@ -3712,6 +3713,7 @@
         <w:rPr>
           <w:b/>
           <w:bCs/>
+          <w:noProof/>
           <w:sz w:val="20"/>
           <w:szCs w:val="20"/>
         </w:rPr>
@@ -3755,6 +3757,7 @@
         <w:rPr>
           <w:b/>
           <w:bCs/>
+          <w:noProof/>
           <w:sz w:val="20"/>
           <w:szCs w:val="20"/>
         </w:rPr>
@@ -3849,6 +3852,7 @@
         <w:rPr>
           <w:b/>
           <w:bCs/>
+          <w:noProof/>
           <w:sz w:val="20"/>
           <w:szCs w:val="20"/>
         </w:rPr>
@@ -4417,6 +4421,50 @@
     <w:p>
       <w:pPr>
         <w:ind w:hanging="2"/>
+        <w:rPr>
+          <w:b/>
+          <w:bCs/>
+          <w:sz w:val="20"/>
+          <w:szCs w:val="20"/>
+        </w:rPr>
+      </w:pPr>
+      <w:r>
+        <w:rPr>
+          <w:b/>
+          <w:bCs/>
+          <w:sz w:val="20"/>
+          <w:szCs w:val="20"/>
+        </w:rPr>
+        <w:t xml:space="preserve">Link google drive: </w:t>
+      </w:r>
+      <w:hyperlink r:id="rId13" w:history="1">
+        <w:r>
+          <w:rPr>
+            <w:rStyle w:val="Hyperlink"/>
+            <w:b/>
+            <w:bCs/>
+            <w:sz w:val="20"/>
+            <w:szCs w:val="20"/>
+          </w:rPr>
+          <w:t>https://drive.google.com/drive/folders/1cEeA1PcLmlewndukp7LW8zwKQtV7sRwe?usp=sharing</w:t>
+        </w:r>
+      </w:hyperlink>
+    </w:p>
+    <w:p>
+      <w:pPr>
+        <w:ind w:hanging="2"/>
+        <w:jc w:val="both"/>
+        <w:rPr>
+          <w:b/>
+          <w:bCs/>
+          <w:sz w:val="20"/>
+          <w:szCs w:val="20"/>
+        </w:rPr>
+      </w:pPr>
+    </w:p>
+    <w:p>
+      <w:pPr>
+        <w:ind w:hanging="2"/>
         <w:jc w:val="both"/>
         <w:rPr>
           <w:b/>
@@ -4491,10 +4539,10 @@
             <v:path o:extrusionok="f" gradientshapeok="t" o:connecttype="rect"/>
             <o:lock v:ext="edit" aspectratio="t"/>
           </v:shapetype>
-          <v:shape id="_x0000_i1035" type="#_x0000_t75" style="width:79.2pt;height:50.4pt" o:ole="">
-            <v:imagedata r:id="rId13" o:title=""/>
+          <v:shape id="_x0000_i1025" type="#_x0000_t75" style="width:79pt;height:50.5pt" o:ole="">
+            <v:imagedata r:id="rId14" o:title=""/>
           </v:shape>
-          <o:OLEObject Type="Embed" ProgID="Package" ShapeID="_x0000_i1035" DrawAspect="Icon" ObjectID="_1849781854" r:id="rId14"/>
+          <o:OLEObject Type="Embed" ProgID="Package" ShapeID="_x0000_i1025" DrawAspect="Icon" ObjectID="_1849783502" r:id="rId15"/>
         </w:object>
       </w:r>
     </w:p>
@@ -4515,23 +4563,57 @@
         <w:ind w:hanging="2"/>
         <w:jc w:val="both"/>
         <w:rPr>
-          <w:b/>
-          <w:bCs/>
-          <w:sz w:val="20"/>
-          <w:szCs w:val="20"/>
-        </w:rPr>
-      </w:pPr>
-      <w:r>
-        <w:rPr>
           <w:color w:val="FFFFFF" w:themeColor="background1"/>
         </w:rPr>
+      </w:pPr>
+      <w:r>
+        <w:rPr>
+          <w:color w:val="FFFFFF" w:themeColor="background1"/>
+        </w:rPr>
         <w:object w:dxaOrig="1536" w:dyaOrig="995" w14:anchorId="32335CC6">
-          <v:shape id="_x0000_i1031" type="#_x0000_t75" style="width:79.2pt;height:50.4pt" o:ole="">
-            <v:imagedata r:id="rId15" o:title=""/>
+          <v:shape id="_x0000_i1026" type="#_x0000_t75" style="width:79pt;height:50.5pt" o:ole="">
+            <v:imagedata r:id="rId16" o:title=""/>
           </v:shape>
-          <o:OLEObject Type="Embed" ProgID="Package" ShapeID="_x0000_i1031" DrawAspect="Icon" ObjectID="_1849781855" r:id="rId16"/>
+          <o:OLEObject Type="Embed" ProgID="Package" ShapeID="_x0000_i1026" DrawAspect="Icon" ObjectID="_1849783503" r:id="rId17"/>
         </w:object>
       </w:r>
+    </w:p>
+    <w:p>
+      <w:pPr>
+        <w:ind w:hanging="2"/>
+        <w:jc w:val="both"/>
+        <w:rPr>
+          <w:color w:val="FFFFFF" w:themeColor="background1"/>
+        </w:rPr>
+      </w:pPr>
+    </w:p>
+    <w:p>
+      <w:pPr>
+        <w:ind w:hanging="2"/>
+        <w:jc w:val="both"/>
+        <w:rPr>
+          <w:color w:val="FFFFFF" w:themeColor="background1"/>
+        </w:rPr>
+      </w:pPr>
+      <w:r>
+        <w:rPr>
+          <w:color w:val="FFFFFF" w:themeColor="background1"/>
+        </w:rPr>
+        <w:t xml:space="preserve">Link </w:t>
+      </w:r>
+    </w:p>
+    <w:p>
+      <w:pPr>
+        <w:ind w:firstLine="0"/>
+        <w:jc w:val="both"/>
+        <w:rPr>
+          <w:b/>
+          <w:bCs/>
+          <w:color w:val="000000" w:themeColor="text1"/>
+          <w:sz w:val="20"/>
+          <w:szCs w:val="20"/>
+        </w:rPr>
+      </w:pPr>
     </w:p>
     <w:sectPr>
       <w:pgSz w:w="11906" w:h="16838"/>
@@ -9254,6 +9336,7 @@
   <w:style w:type="character" w:default="1" w:styleId="Fontepargpadro">
     <w:name w:val="Default Paragraph Font"/>
     <w:uiPriority w:val="1"/>
+    <w:semiHidden/>
     <w:unhideWhenUsed/>
   </w:style>
   <w:style w:type="table" w:default="1" w:styleId="Tabelanormal">
@@ -10249,6 +10332,29 @@
     <w:basedOn w:val="Fontepargpadro"/>
     <w:rsid w:val="003B77E8"/>
   </w:style>
+  <w:style w:type="character" w:styleId="Hyperlink">
+    <w:name w:val="Hyperlink"/>
+    <w:basedOn w:val="Fontepargpadro"/>
+    <w:uiPriority w:val="99"/>
+    <w:unhideWhenUsed/>
+    <w:rsid w:val="006B7ECA"/>
+    <w:rPr>
+      <w:color w:val="467886" w:themeColor="hyperlink"/>
+      <w:u w:val="single"/>
+    </w:rPr>
+  </w:style>
+  <w:style w:type="character" w:styleId="MenoPendente">
+    <w:name w:val="Unresolved Mention"/>
+    <w:basedOn w:val="Fontepargpadro"/>
+    <w:uiPriority w:val="99"/>
+    <w:semiHidden/>
+    <w:unhideWhenUsed/>
+    <w:rsid w:val="006B7ECA"/>
+    <w:rPr>
+      <w:color w:val="605E5C"/>
+      <w:shd w:val="clear" w:color="auto" w:fill="E1DFDD"/>
+    </w:rPr>
+  </w:style>
 </w:styles>
 </file>
 

</xml_diff>